<commit_message>
Max Zhou, and keep place-card names clear of the foliage
Max only ever appeared as 'Max' because the guest list gave him no surname -
the rename to Zhou passed him by. He is now Max Zhou on his place card and on
the website, and he joins the corrections sheet, which is page 4 either way
since he sits on the same sheet as Jojo and Tony.

The place-card text box started 13mm in from the card edge while the border's
foliage reaches about 21mm in, so the box ran underneath the artwork. No name
was actually colliding, but only because they all happened to be short enough.
The box is now inset 22mm to match the border's clear opening, so the margin
is structural rather than luck.

Co-Authored-By: Claude Opus 5 (1M context) <noreply@anthropic.com>
</commit_message>
<xml_diff>
--- a/print/CORRECTIONS.docx
+++ b/print/CORRECTIONS.docx
@@ -941,15 +941,120 @@
           <w:noProof/>
         </w:rPr>
         <w:drawing>
+          <wp:anchor distT="0" distB="0" distL="0" distR="0" simplePos="0" relativeHeight="22" behindDoc="0" locked="0" layoutInCell="0" allowOverlap="1">
+            <wp:simplePos x="0" y="0"/>
+            <wp:positionH relativeFrom="page">
+              <wp:posOffset>792000</wp:posOffset>
+            </wp:positionH>
+            <wp:positionV relativeFrom="page">
+              <wp:posOffset>8343000</wp:posOffset>
+            </wp:positionV>
+            <wp:extent cx="2196000" cy="2025000"/>
+            <wp:effectExtent l="0" t="0" r="0" b="0"/>
+            <wp:wrapNone/>
+            <wp:docPr id="202" name="Card 202"/>
+            <wp:cNvGraphicFramePr/>
+            <a:graphic xmlns:a="http://schemas.openxmlformats.org/drawingml/2006/main">
+              <a:graphicData uri="http://schemas.microsoft.com/office/word/2010/wordprocessingShape">
+                <wps:wsp>
+                  <wps:cNvSpPr txBox="1"/>
+                  <wps:spPr>
+                    <a:xfrm>
+                      <a:off x="0" y="0"/>
+                      <a:ext cx="2196000" cy="2025000"/>
+                    </a:xfrm>
+                    <a:prstGeom prst="rect">
+                      <a:avLst/>
+                    </a:prstGeom>
+                    <a:noFill/>
+                    <a:ln>
+                      <a:noFill/>
+                    </a:ln>
+                  </wps:spPr>
+                  <wps:txbx>
+                    <w:txbxContent>
+                      <w:p>
+                        <w:pPr>
+                          <w:spacing w:before="0" w:after="40"/>
+                          <w:jc w:val="center"/>
+                        </w:pPr>
+                        <w:r>
+                          <w:rPr>
+                            <w:rFonts w:ascii="Georgia" w:hAnsi="Georgia" w:cs="Georgia" w:eastAsia="Georgia"/>
+                            <w:b w:val="0"/>
+                            <w:i w:val="0"/>
+                            <w:color w:val="2C5D63"/>
+                            <w:sz w:val="12"/>
+                            <w:spacing w:val="40"/>
+                            <w:caps w:val="1"/>
+                          </w:rPr>
+                          <w:t>Top Table</w:t>
+                        </w:r>
+                      </w:p>
+                      <w:p>
+                        <w:pPr>
+                          <w:spacing w:before="0" w:after="40"/>
+                          <w:jc w:val="center"/>
+                        </w:pPr>
+                        <w:r>
+                          <w:rPr>
+                            <w:rFonts w:ascii="Georgia" w:hAnsi="Georgia" w:cs="Georgia" w:eastAsia="Georgia"/>
+                            <w:b/>
+                            <w:i w:val="0"/>
+                            <w:color w:val="222D2A"/>
+                            <w:sz w:val="40"/>
+                          </w:rPr>
+                          <w:t>Max Zhou</w:t>
+                        </w:r>
+                      </w:p>
+                      <w:p>
+                        <w:pPr>
+                          <w:spacing w:before="0" w:after="0"/>
+                          <w:jc w:val="center"/>
+                        </w:pPr>
+                        <w:r>
+                          <w:rPr>
+                            <w:rFonts w:ascii="Georgia" w:hAnsi="Georgia" w:cs="Georgia" w:eastAsia="Georgia"/>
+                            <w:b w:val="0"/>
+                            <w:i w:val="0"/>
+                            <w:color w:val="2C5D63"/>
+                            <w:sz w:val="13"/>
+                            <w:spacing w:val="40"/>
+                          </w:rPr>
+                          <w:t>· · ·</w:t>
+                        </w:r>
+                      </w:p>
+                    </w:txbxContent>
+                  </wps:txbx>
+                  <wps:bodyPr rot="0" spcFirstLastPara="0" vert="horz" wrap="square" lIns="0" tIns="0" rIns="0" bIns="0" numCol="1" anchor="ctr" anchorCtr="0" upright="0">
+                    <a:noAutofit/>
+                  </wps:bodyPr>
+                </wps:wsp>
+              </a:graphicData>
+            </a:graphic>
+          </wp:anchor>
+        </w:drawing>
+      </w:r>
+    </w:p>
+    <w:p>
+      <w:pPr>
+        <w:spacing w:before="0" w:after="0" w:line="20" w:lineRule="exact"/>
+      </w:pPr>
+      <w:r>
+        <w:rPr>
+          <w:sz w:val="2"/>
+          <w:noProof/>
+        </w:rPr>
+        <w:drawing>
           <wp:anchor distT="0" distB="0" distL="0" distR="0" simplePos="0" relativeHeight="21" behindDoc="0" locked="0" layoutInCell="0" allowOverlap="1">
             <wp:simplePos x="0" y="0"/>
             <wp:positionH relativeFrom="page">
-              <wp:posOffset>4248000</wp:posOffset>
+              <wp:posOffset>4572000</wp:posOffset>
             </wp:positionH>
             <wp:positionV relativeFrom="page">
-              <wp:posOffset>2889000</wp:posOffset>
+              <wp:posOffset>2997000</wp:posOffset>
             </wp:positionV>
-            <wp:extent cx="2844000" cy="2241000"/>
+            <wp:extent cx="2196000" cy="2025000"/>
             <wp:effectExtent l="0" t="0" r="0" b="0"/>
             <wp:wrapNone/>
             <wp:docPr id="201" name="Card 201"/>
@@ -961,7 +1066,7 @@
                   <wps:spPr>
                     <a:xfrm>
                       <a:off x="0" y="0"/>
-                      <a:ext cx="2844000" cy="2241000"/>
+                      <a:ext cx="2196000" cy="2025000"/>
                     </a:xfrm>
                     <a:prstGeom prst="rect">
                       <a:avLst/>
@@ -1049,12 +1154,12 @@
           <wp:anchor distT="0" distB="0" distL="0" distR="0" simplePos="0" relativeHeight="20" behindDoc="0" locked="0" layoutInCell="0" allowOverlap="1">
             <wp:simplePos x="0" y="0"/>
             <wp:positionH relativeFrom="page">
-              <wp:posOffset>468000</wp:posOffset>
+              <wp:posOffset>792000</wp:posOffset>
             </wp:positionH>
             <wp:positionV relativeFrom="page">
-              <wp:posOffset>2889000</wp:posOffset>
+              <wp:posOffset>2997000</wp:posOffset>
             </wp:positionV>
-            <wp:extent cx="2844000" cy="2241000"/>
+            <wp:extent cx="2196000" cy="2025000"/>
             <wp:effectExtent l="0" t="0" r="0" b="0"/>
             <wp:wrapNone/>
             <wp:docPr id="200" name="Card 200"/>
@@ -1066,7 +1171,7 @@
                   <wps:spPr>
                     <a:xfrm>
                       <a:off x="0" y="0"/>
-                      <a:ext cx="2844000" cy="2241000"/>
+                      <a:ext cx="2196000" cy="2025000"/>
                     </a:xfrm>
                     <a:prstGeom prst="rect">
                       <a:avLst/>

</xml_diff>